<commit_message>
1 razdel typa top
</commit_message>
<xml_diff>
--- a/КП/course_project_Fetisov/КП-ФЕТИСОВ-ИСПП-31.docx
+++ b/КП/course_project_Fetisov/КП-ФЕТИСОВ-ИСПП-31.docx
@@ -1,6 +1,6 @@
 
 <file path=word/document.xml><?xml version="1.0" encoding="utf-8"?>
-<w:document xmlns:wpc="http://schemas.microsoft.com/office/word/2010/wordprocessingCanvas" xmlns:cx="http://schemas.microsoft.com/office/drawing/2014/chartex" xmlns:cx1="http://schemas.microsoft.com/office/drawing/2015/9/8/chartex" xmlns:cx2="http://schemas.microsoft.com/office/drawing/2015/10/21/chartex" xmlns:cx3="http://schemas.microsoft.com/office/drawing/2016/5/9/chartex" xmlns:cx4="http://schemas.microsoft.com/office/drawing/2016/5/10/chartex" xmlns:cx5="http://schemas.microsoft.com/office/drawing/2016/5/11/chartex" xmlns:cx6="http://schemas.microsoft.com/office/drawing/2016/5/12/chartex" xmlns:cx7="http://schemas.microsoft.com/office/drawing/2016/5/13/chartex" xmlns:cx8="http://schemas.microsoft.com/office/drawing/2016/5/14/chartex" xmlns:mc="http://schemas.openxmlformats.org/markup-compatibility/2006" xmlns:aink="http://schemas.microsoft.com/office/drawing/2016/ink" xmlns:am3d="http://schemas.microsoft.com/office/drawing/2017/model3d" xmlns:o="urn:schemas-microsoft-com:office:office" xmlns:oel="http://schemas.microsoft.com/office/2019/extlst" xmlns:r="http://schemas.openxmlformats.org/officeDocument/2006/relationships" xmlns:m="http://schemas.openxmlformats.org/officeDocument/2006/math" xmlns:v="urn:schemas-microsoft-com:vml" xmlns:wp14="http://schemas.microsoft.com/office/word/2010/wordprocessingDrawing" xmlns:wp="http://schemas.openxmlformats.org/drawingml/2006/wordprocessingDrawing" xmlns:w10="urn:schemas-microsoft-com:office:word" xmlns:w="http://schemas.openxmlformats.org/wordprocessingml/2006/main" xmlns:w14="http://schemas.microsoft.com/office/word/2010/wordml" xmlns:w15="http://schemas.microsoft.com/office/word/2012/wordml" xmlns:w16cex="http://schemas.microsoft.com/office/word/2018/wordml/cex" xmlns:w16cid="http://schemas.microsoft.com/office/word/2016/wordml/cid" xmlns:w16="http://schemas.microsoft.com/office/word/2018/wordml" xmlns:w16sdtdh="http://schemas.microsoft.com/office/word/2020/wordml/sdtdatahash" xmlns:w16se="http://schemas.microsoft.com/office/word/2015/wordml/symex" xmlns:wpg="http://schemas.microsoft.com/office/word/2010/wordprocessingGroup" xmlns:wpi="http://schemas.microsoft.com/office/word/2010/wordprocessingInk" xmlns:wne="http://schemas.microsoft.com/office/word/2006/wordml" xmlns:wps="http://schemas.microsoft.com/office/word/2010/wordprocessingShape" mc:Ignorable="w14 w15 w16se w16cid w16 w16cex w16sdtdh wp14">
+<w:document xmlns:wpc="http://schemas.microsoft.com/office/word/2010/wordprocessingCanvas" xmlns:cx="http://schemas.microsoft.com/office/drawing/2014/chartex" xmlns:mc="http://schemas.openxmlformats.org/markup-compatibility/2006" xmlns:o="urn:schemas-microsoft-com:office:office" xmlns:r="http://schemas.openxmlformats.org/officeDocument/2006/relationships" xmlns:m="http://schemas.openxmlformats.org/officeDocument/2006/math" xmlns:v="urn:schemas-microsoft-com:vml" xmlns:wp14="http://schemas.microsoft.com/office/word/2010/wordprocessingDrawing" xmlns:wp="http://schemas.openxmlformats.org/drawingml/2006/wordprocessingDrawing" xmlns:w10="urn:schemas-microsoft-com:office:word" xmlns:w="http://schemas.openxmlformats.org/wordprocessingml/2006/main" xmlns:w14="http://schemas.microsoft.com/office/word/2010/wordml" xmlns:w15="http://schemas.microsoft.com/office/word/2012/wordml" xmlns:w16se="http://schemas.microsoft.com/office/word/2015/wordml/symex" xmlns:wpg="http://schemas.microsoft.com/office/word/2010/wordprocessingGroup" xmlns:wpi="http://schemas.microsoft.com/office/word/2010/wordprocessingInk" xmlns:wne="http://schemas.microsoft.com/office/word/2006/wordml" xmlns:wps="http://schemas.microsoft.com/office/word/2010/wordprocessingShape" mc:Ignorable="w14 w15 w16se wp14">
   <w:body>
     <w:sdt>
       <w:sdtPr>
@@ -136,7 +136,35 @@
               <w:lang w:eastAsia="ru-RU"/>
               <w14:ligatures w14:val="none"/>
             </w:rPr>
-            <w:t>(СПбГУТ)</w:t>
+            <w:t>(</w:t>
+          </w:r>
+          <w:proofErr w:type="spellStart"/>
+          <w:r>
+            <w:rPr>
+              <w:rFonts w:eastAsia="Times New Roman" w:cs="Times New Roman"/>
+              <w:b/>
+              <w:bCs/>
+              <w:kern w:val="0"/>
+              <w:sz w:val="24"/>
+              <w:szCs w:val="24"/>
+              <w:lang w:eastAsia="ru-RU"/>
+              <w14:ligatures w14:val="none"/>
+            </w:rPr>
+            <w:t>СПбГУТ</w:t>
+          </w:r>
+          <w:proofErr w:type="spellEnd"/>
+          <w:r>
+            <w:rPr>
+              <w:rFonts w:eastAsia="Times New Roman" w:cs="Times New Roman"/>
+              <w:b/>
+              <w:bCs/>
+              <w:kern w:val="0"/>
+              <w:sz w:val="24"/>
+              <w:szCs w:val="24"/>
+              <w:lang w:eastAsia="ru-RU"/>
+              <w14:ligatures w14:val="none"/>
+            </w:rPr>
+            <w:t>)</w:t>
           </w:r>
         </w:p>
         <w:p>
@@ -207,8 +235,23 @@
               <w:lang w:eastAsia="ru-RU"/>
               <w14:ligatures w14:val="none"/>
             </w:rPr>
-            <w:t>ИМ. Б.Л. РОЗИНГА (ФИЛИАЛ) СПбГУТ</w:t>
+            <w:t xml:space="preserve">ИМ. Б.Л. РОЗИНГА (ФИЛИАЛ) </w:t>
           </w:r>
+          <w:proofErr w:type="spellStart"/>
+          <w:r>
+            <w:rPr>
+              <w:rFonts w:eastAsia="Times New Roman" w:cs="Times New Roman"/>
+              <w:b/>
+              <w:bCs/>
+              <w:kern w:val="0"/>
+              <w:sz w:val="24"/>
+              <w:szCs w:val="24"/>
+              <w:lang w:eastAsia="ru-RU"/>
+              <w14:ligatures w14:val="none"/>
+            </w:rPr>
+            <w:t>СПбГУТ</w:t>
+          </w:r>
+          <w:proofErr w:type="spellEnd"/>
         </w:p>
         <w:p>
           <w:pPr>
@@ -235,7 +278,35 @@
               <w:lang w:eastAsia="ru-RU"/>
               <w14:ligatures w14:val="none"/>
             </w:rPr>
-            <w:t>(АКТ (ф) СПбГУТ)</w:t>
+            <w:t xml:space="preserve">(АКТ (ф) </w:t>
+          </w:r>
+          <w:proofErr w:type="spellStart"/>
+          <w:r>
+            <w:rPr>
+              <w:rFonts w:eastAsia="Times New Roman" w:cs="Times New Roman"/>
+              <w:b/>
+              <w:bCs/>
+              <w:kern w:val="0"/>
+              <w:sz w:val="24"/>
+              <w:szCs w:val="24"/>
+              <w:lang w:eastAsia="ru-RU"/>
+              <w14:ligatures w14:val="none"/>
+            </w:rPr>
+            <w:t>СПбГУТ</w:t>
+          </w:r>
+          <w:proofErr w:type="spellEnd"/>
+          <w:r>
+            <w:rPr>
+              <w:rFonts w:eastAsia="Times New Roman" w:cs="Times New Roman"/>
+              <w:b/>
+              <w:bCs/>
+              <w:kern w:val="0"/>
+              <w:sz w:val="24"/>
+              <w:szCs w:val="24"/>
+              <w:lang w:eastAsia="ru-RU"/>
+              <w14:ligatures w14:val="none"/>
+            </w:rPr>
+            <w:t>)</w:t>
           </w:r>
         </w:p>
         <w:p>
@@ -1271,8 +1342,21 @@
                     <w:lang w:eastAsia="ru-RU"/>
                     <w14:ligatures w14:val="none"/>
                   </w:rPr>
-                  <w:t>Ю.С. Маломан</w:t>
+                  <w:t xml:space="preserve">Ю.С. </w:t>
                 </w:r>
+                <w:proofErr w:type="spellStart"/>
+                <w:r>
+                  <w:rPr>
+                    <w:rFonts w:eastAsia="Times New Roman" w:cs="Times New Roman"/>
+                    <w:iCs/>
+                    <w:kern w:val="0"/>
+                    <w:szCs w:val="28"/>
+                    <w:lang w:eastAsia="ru-RU"/>
+                    <w14:ligatures w14:val="none"/>
+                  </w:rPr>
+                  <w:t>Маломан</w:t>
+                </w:r>
+                <w:proofErr w:type="spellEnd"/>
               </w:p>
             </w:tc>
           </w:tr>
@@ -3177,13 +3261,10 @@
         <w:t xml:space="preserve"> для</w:t>
       </w:r>
       <w:r>
-        <w:t xml:space="preserve"> </w:t>
-      </w:r>
-      <w:r>
         <w:rPr>
           <w:rFonts w:eastAsia="Times New Roman"/>
         </w:rPr>
-        <w:t>автоматизации и упрощения процесса совместного разбора, смыслового анализа и контекстного аннотирования музыкальных произведений, снижения временных затрат на поиск скрытых смыслов, метафор и авторского контекста, а также для минимизации ошибок при трактовке культурных отсылок и замысла автора</w:t>
+        <w:t xml:space="preserve"> упрощения процесса совместного разбора, смыслового анализа и контекстного аннотирования музыкальных произведений, снижения временных затрат на поиск скрытых смыслов, метафор и авторского контекста, а также для минимизации ошибок при трактовке культурных отсылок и замысла автора</w:t>
       </w:r>
       <w:r>
         <w:t>.</w:t>
@@ -3194,7 +3275,19 @@
         <w:pStyle w:val="a3"/>
       </w:pPr>
       <w:r>
-        <w:t>Областью применения данной программы являются образовательные онлайн-ресурсы, филологические и культурологические проекты, направленные на анализ современной поэзии, изучение лингвистических и стилистических особенностей текстов песен.</w:t>
+        <w:t xml:space="preserve">Областью применения </w:t>
+      </w:r>
+      <w:r>
+        <w:t>приложения</w:t>
+      </w:r>
+      <w:r>
+        <w:t xml:space="preserve"> являются образовательные онлайн-ресурсы, филологические и культурологические проекты, направленные на анализ современной поэзии</w:t>
+      </w:r>
+      <w:r>
+        <w:t xml:space="preserve"> и</w:t>
+      </w:r>
+      <w:r>
+        <w:t xml:space="preserve"> изучение лингвистических и стилистических особенностей текстов песен.</w:t>
       </w:r>
     </w:p>
     <w:p>
@@ -3230,10 +3323,24 @@
         <w:pStyle w:val="a1"/>
       </w:pPr>
       <w:r>
+        <w:rPr>
+          <w:highlight w:val="yellow"/>
+        </w:rPr>
+        <w:t>авторизованные пользователи</w:t>
+      </w:r>
+      <w:r>
+        <w:t>;</w:t>
+      </w:r>
+    </w:p>
+    <w:p>
+      <w:pPr>
+        <w:pStyle w:val="a1"/>
+      </w:pPr>
+      <w:r>
         <w:t>а</w:t>
       </w:r>
       <w:r>
-        <w:t>вторизованные пользователи;</w:t>
+        <w:t>вторы песен;</w:t>
       </w:r>
     </w:p>
     <w:p>
@@ -3241,10 +3348,449 @@
         <w:pStyle w:val="a1"/>
       </w:pPr>
       <w:r>
-        <w:t>а</w:t>
-      </w:r>
-      <w:r>
-        <w:t>вторы песен;</w:t>
+        <w:t>м</w:t>
+      </w:r>
+      <w:r>
+        <w:t>узыкальные критики</w:t>
+      </w:r>
+      <w:r>
+        <w:t>.</w:t>
+      </w:r>
+    </w:p>
+    <w:p>
+      <w:pPr>
+        <w:pStyle w:val="2"/>
+      </w:pPr>
+      <w:bookmarkStart w:id="4" w:name="_Toc243983717"/>
+      <w:r>
+        <w:t>Постановка задачи</w:t>
+      </w:r>
+      <w:bookmarkEnd w:id="4"/>
+    </w:p>
+    <w:p>
+      <w:pPr>
+        <w:pStyle w:val="a3"/>
+      </w:pPr>
+      <w:r>
+        <w:rPr>
+          <w:highlight w:val="yellow"/>
+        </w:rPr>
+        <w:t>Разрабатываемое ПО</w:t>
+      </w:r>
+      <w:r>
+        <w:rPr>
+          <w:highlight w:val="yellow"/>
+        </w:rPr>
+        <w:t xml:space="preserve"> будет</w:t>
+      </w:r>
+      <w:r>
+        <w:rPr>
+          <w:highlight w:val="yellow"/>
+        </w:rPr>
+        <w:t xml:space="preserve"> представля</w:t>
+      </w:r>
+      <w:r>
+        <w:rPr>
+          <w:highlight w:val="yellow"/>
+        </w:rPr>
+        <w:t>ть</w:t>
+      </w:r>
+      <w:r>
+        <w:rPr>
+          <w:highlight w:val="yellow"/>
+        </w:rPr>
+        <w:t xml:space="preserve"> собой клиент-серверное веб-приложение. Серверная часть </w:t>
+      </w:r>
+      <w:r>
+        <w:rPr>
+          <w:highlight w:val="yellow"/>
+        </w:rPr>
+        <w:t xml:space="preserve">будет </w:t>
+      </w:r>
+      <w:r>
+        <w:rPr>
+          <w:highlight w:val="yellow"/>
+        </w:rPr>
+        <w:t>реализована</w:t>
+      </w:r>
+      <w:r>
+        <w:rPr>
+          <w:highlight w:val="yellow"/>
+        </w:rPr>
+        <w:t xml:space="preserve"> </w:t>
+      </w:r>
+      <w:r>
+        <w:rPr>
+          <w:highlight w:val="yellow"/>
+        </w:rPr>
+        <w:t xml:space="preserve">на платформе ASP.NET </w:t>
+      </w:r>
+      <w:proofErr w:type="spellStart"/>
+      <w:r>
+        <w:rPr>
+          <w:highlight w:val="yellow"/>
+        </w:rPr>
+        <w:t>Core</w:t>
+      </w:r>
+      <w:proofErr w:type="spellEnd"/>
+      <w:r>
+        <w:rPr>
+          <w:highlight w:val="yellow"/>
+        </w:rPr>
+        <w:t xml:space="preserve"> и </w:t>
+      </w:r>
+      <w:r>
+        <w:rPr>
+          <w:highlight w:val="yellow"/>
+        </w:rPr>
+        <w:t xml:space="preserve">будет обеспечивать </w:t>
+      </w:r>
+      <w:r>
+        <w:rPr>
+          <w:highlight w:val="yellow"/>
+        </w:rPr>
+        <w:t xml:space="preserve">бизнес-логику, разграничение прав доступа и взаимодействие с </w:t>
+      </w:r>
+      <w:r>
+        <w:rPr>
+          <w:highlight w:val="yellow"/>
+        </w:rPr>
+        <w:t>БД</w:t>
+      </w:r>
+      <w:r>
+        <w:rPr>
+          <w:highlight w:val="yellow"/>
+        </w:rPr>
+        <w:t xml:space="preserve"> </w:t>
+      </w:r>
+      <w:proofErr w:type="spellStart"/>
+      <w:r>
+        <w:rPr>
+          <w:highlight w:val="yellow"/>
+        </w:rPr>
+        <w:t>PostgreSQL</w:t>
+      </w:r>
+      <w:proofErr w:type="spellEnd"/>
+      <w:r>
+        <w:rPr>
+          <w:highlight w:val="yellow"/>
+        </w:rPr>
+        <w:t xml:space="preserve">, которая отвечает за централизованное хранение информации и многопользовательский режим работы. Клиентская </w:t>
+      </w:r>
+      <w:r>
+        <w:rPr>
+          <w:highlight w:val="yellow"/>
+        </w:rPr>
+        <w:t>часть</w:t>
+      </w:r>
+      <w:r>
+        <w:rPr>
+          <w:highlight w:val="yellow"/>
+        </w:rPr>
+        <w:t xml:space="preserve"> будет</w:t>
+      </w:r>
+      <w:r>
+        <w:rPr>
+          <w:highlight w:val="yellow"/>
+        </w:rPr>
+        <w:t xml:space="preserve"> обеспечива</w:t>
+      </w:r>
+      <w:r>
+        <w:rPr>
+          <w:highlight w:val="yellow"/>
+        </w:rPr>
+        <w:t>ть</w:t>
+      </w:r>
+      <w:r>
+        <w:rPr>
+          <w:highlight w:val="yellow"/>
+        </w:rPr>
+        <w:t xml:space="preserve"> интерактивный пользовательский интерфейс для работы с текстами и аннотациями в веб-браузере.</w:t>
+      </w:r>
+    </w:p>
+    <w:p>
+      <w:pPr>
+        <w:pStyle w:val="a3"/>
+      </w:pPr>
+      <w:r>
+        <w:t xml:space="preserve">Пользователь должен иметь возможность просматривать каталог исполнителей, альбомов и музыкальных треков, осуществлять поиск и </w:t>
+      </w:r>
+      <w:r>
+        <w:lastRenderedPageBreak/>
+        <w:t>фильтрацию песен по жанрам, популярности и дате релиза, а также проходить регистрацию и авторизацию для доступа к личном</w:t>
+      </w:r>
+      <w:r>
+        <w:t>у</w:t>
+      </w:r>
+      <w:r>
+        <w:t xml:space="preserve"> кабинету.</w:t>
+      </w:r>
+    </w:p>
+    <w:p>
+      <w:pPr>
+        <w:pStyle w:val="a3"/>
+      </w:pPr>
+      <w:r>
+        <w:t>Авторизованный пользователь должен иметь возможность интерактивно выделять фрагменты текста песен, предлагать свои варианты интерпретации, участвовать в обсуждениях, комментировать разборы и голосовать за наиболее точные трактовки смыслов.</w:t>
+      </w:r>
+    </w:p>
+    <w:p>
+      <w:pPr>
+        <w:pStyle w:val="a3"/>
+      </w:pPr>
+      <w:r>
+        <w:t>Автор песен должен иметь доступ к управлению каталогом собственных треков, добавлени</w:t>
+      </w:r>
+      <w:r>
+        <w:t>ю</w:t>
+      </w:r>
+      <w:r>
+        <w:t xml:space="preserve"> и редактировани</w:t>
+      </w:r>
+      <w:r>
+        <w:t>ю</w:t>
+      </w:r>
+      <w:r>
+        <w:t xml:space="preserve"> официальных текстов песен, публикации подтвержденных аннотаций от своего имени, а также к выгрузк</w:t>
+      </w:r>
+      <w:r>
+        <w:t>е</w:t>
+      </w:r>
+      <w:r>
+        <w:t xml:space="preserve"> статистических данных по просмотрам </w:t>
+      </w:r>
+      <w:r>
+        <w:t>треков в формате *</w:t>
+      </w:r>
+      <w:r>
+        <w:t>.</w:t>
+      </w:r>
+      <w:proofErr w:type="spellStart"/>
+      <w:r>
+        <w:t>csv</w:t>
+      </w:r>
+      <w:proofErr w:type="spellEnd"/>
+      <w:r>
+        <w:t xml:space="preserve"> для последующего анализа.</w:t>
+      </w:r>
+    </w:p>
+    <w:p>
+      <w:pPr>
+        <w:pStyle w:val="a3"/>
+      </w:pPr>
+      <w:r>
+        <w:t>Музыкальный критик должен обладать инструментами для написания развернутых экспертных разборов на музыкальные произведения, а также механизмами верификации и подтверждения пользовательских аннотаций</w:t>
+      </w:r>
+      <w:r>
+        <w:t xml:space="preserve"> для</w:t>
+      </w:r>
+      <w:r>
+        <w:t xml:space="preserve"> устан</w:t>
+      </w:r>
+      <w:r>
+        <w:t>овки</w:t>
+      </w:r>
+      <w:r>
+        <w:t xml:space="preserve"> </w:t>
+      </w:r>
+      <w:r>
+        <w:t>их</w:t>
+      </w:r>
+      <w:r>
+        <w:t xml:space="preserve"> статус</w:t>
+      </w:r>
+      <w:r>
+        <w:t>а достоверности</w:t>
+      </w:r>
+      <w:r>
+        <w:t>.</w:t>
+      </w:r>
+    </w:p>
+    <w:p>
+      <w:pPr>
+        <w:pStyle w:val="2"/>
+      </w:pPr>
+      <w:bookmarkStart w:id="5" w:name="_Toc243983718"/>
+      <w:r>
+        <w:t>Выбор состава программных и технических средств</w:t>
+      </w:r>
+      <w:bookmarkEnd w:id="5"/>
+    </w:p>
+    <w:p>
+      <w:pPr>
+        <w:pStyle w:val="a3"/>
+      </w:pPr>
+      <w:r>
+        <w:t xml:space="preserve">Архитектура решения является веб-ориентированной, трехзвенной (клиент-сервер-база данных): клиентская часть </w:t>
+      </w:r>
+      <w:r>
+        <w:rPr>
+          <w:highlight w:val="yellow"/>
+        </w:rPr>
+        <w:t>функционирует</w:t>
+      </w:r>
+      <w:bookmarkStart w:id="6" w:name="_GoBack"/>
+      <w:bookmarkEnd w:id="6"/>
+      <w:r>
+        <w:t xml:space="preserve"> в веб-браузере пользователя и взаимодействует через протокол HTTP/HTTPS с серверной частью, которая, в свою очередь, обрабатывает бизнес-логику и осуществляет безопасный доступ к централизованной базе данных.</w:t>
+      </w:r>
+    </w:p>
+    <w:p>
+      <w:pPr>
+        <w:pStyle w:val="a3"/>
+      </w:pPr>
+      <w:r>
+        <w:t xml:space="preserve">Серверная часть реализуется на языке C# с использованием платформы ASP.NET </w:t>
+      </w:r>
+      <w:proofErr w:type="spellStart"/>
+      <w:r>
+        <w:t>Core</w:t>
+      </w:r>
+      <w:proofErr w:type="spellEnd"/>
+      <w:r>
+        <w:t xml:space="preserve">. </w:t>
+      </w:r>
+      <w:r>
+        <w:t>Этот язык</w:t>
+      </w:r>
+      <w:r>
+        <w:t xml:space="preserve"> выбран из-за высокой производительности, кроссплатформенности и развитых средств разграничения прав доступа. Вся ключевая бизнес-логика изолирована на стороне сервера, что гарантирует безопасность данных и исключает прямой доступ клиентов к хранилищу.</w:t>
+      </w:r>
+    </w:p>
+    <w:p>
+      <w:pPr>
+        <w:pStyle w:val="a3"/>
+      </w:pPr>
+      <w:r>
+        <w:t xml:space="preserve">Доступ к данным выполняется через ORM-систему </w:t>
+      </w:r>
+      <w:proofErr w:type="spellStart"/>
+      <w:r>
+        <w:t>Entity</w:t>
+      </w:r>
+      <w:proofErr w:type="spellEnd"/>
+      <w:r>
+        <w:t xml:space="preserve"> </w:t>
+      </w:r>
+      <w:proofErr w:type="spellStart"/>
+      <w:r>
+        <w:t>Framework</w:t>
+      </w:r>
+      <w:proofErr w:type="spellEnd"/>
+      <w:r>
+        <w:t xml:space="preserve"> </w:t>
+      </w:r>
+      <w:proofErr w:type="spellStart"/>
+      <w:r>
+        <w:t>Core</w:t>
+      </w:r>
+      <w:proofErr w:type="spellEnd"/>
+      <w:r>
+        <w:t xml:space="preserve">, которая автоматизирует составление SQL-запросов. Данные хранятся в </w:t>
+      </w:r>
+      <w:r>
+        <w:lastRenderedPageBreak/>
+        <w:t xml:space="preserve">СУБД </w:t>
+      </w:r>
+      <w:proofErr w:type="spellStart"/>
+      <w:r>
+        <w:t>PostgreSQL</w:t>
+      </w:r>
+      <w:proofErr w:type="spellEnd"/>
+      <w:r>
+        <w:t>, выбранной благодаря ее высокой надежности, бесплатной лицензии</w:t>
+      </w:r>
+      <w:r>
+        <w:t>.</w:t>
+      </w:r>
+    </w:p>
+    <w:p>
+      <w:pPr>
+        <w:pStyle w:val="a3"/>
+      </w:pPr>
+      <w:r>
+        <w:t xml:space="preserve">Разработка серверной и клиентской частей ПО осуществляется в IDE </w:t>
+      </w:r>
+      <w:proofErr w:type="spellStart"/>
+      <w:r>
+        <w:t>Microsoft</w:t>
+      </w:r>
+      <w:proofErr w:type="spellEnd"/>
+      <w:r>
+        <w:t xml:space="preserve"> </w:t>
+      </w:r>
+      <w:proofErr w:type="spellStart"/>
+      <w:r>
+        <w:t>Visual</w:t>
+      </w:r>
+      <w:proofErr w:type="spellEnd"/>
+      <w:r>
+        <w:t xml:space="preserve"> </w:t>
+      </w:r>
+      <w:proofErr w:type="spellStart"/>
+      <w:r>
+        <w:t>Studio</w:t>
+      </w:r>
+      <w:proofErr w:type="spellEnd"/>
+      <w:r>
+        <w:t xml:space="preserve"> 2026</w:t>
+      </w:r>
+      <w:r>
+        <w:t xml:space="preserve">, которая выбрана благодаря её полной </w:t>
+      </w:r>
+      <w:proofErr w:type="spellStart"/>
+      <w:r>
+        <w:t>нативной</w:t>
+      </w:r>
+      <w:proofErr w:type="spellEnd"/>
+      <w:r>
+        <w:t xml:space="preserve"> интеграции с платформой ASP.NET </w:t>
+      </w:r>
+      <w:proofErr w:type="spellStart"/>
+      <w:r>
+        <w:t>Core</w:t>
+      </w:r>
+      <w:proofErr w:type="spellEnd"/>
+      <w:r>
+        <w:t xml:space="preserve"> и языком C#, развитым визуальным инструментам для проектирования архитектуры, а также</w:t>
+      </w:r>
+      <w:r>
+        <w:t xml:space="preserve"> </w:t>
+      </w:r>
+      <w:r>
+        <w:t xml:space="preserve">встроенным средствам профилирования производительности, отладки веб-запросов и управления миграциями базы данных </w:t>
+      </w:r>
+      <w:proofErr w:type="spellStart"/>
+      <w:r>
+        <w:t>Entity</w:t>
+      </w:r>
+      <w:proofErr w:type="spellEnd"/>
+      <w:r>
+        <w:t xml:space="preserve"> </w:t>
+      </w:r>
+      <w:proofErr w:type="spellStart"/>
+      <w:r>
+        <w:t>Framework</w:t>
+      </w:r>
+      <w:proofErr w:type="spellEnd"/>
+      <w:r>
+        <w:t xml:space="preserve"> </w:t>
+      </w:r>
+      <w:proofErr w:type="spellStart"/>
+      <w:r>
+        <w:t>Core</w:t>
+      </w:r>
+      <w:proofErr w:type="spellEnd"/>
+      <w:r>
+        <w:t xml:space="preserve"> в едином рабочем пространстве.</w:t>
+      </w:r>
+    </w:p>
+    <w:p>
+      <w:pPr>
+        <w:pStyle w:val="a3"/>
+      </w:pPr>
+      <w:r>
+        <w:t>К клиентскому компьютеру предъявляются требования:</w:t>
       </w:r>
     </w:p>
     <w:p>
@@ -3252,190 +3798,107 @@
         <w:pStyle w:val="a1"/>
       </w:pPr>
       <w:r>
-        <w:t>м</w:t>
-      </w:r>
-      <w:r>
-        <w:t>узыкальные критики</w:t>
-      </w:r>
-      <w:r>
-        <w:t>.</w:t>
-      </w:r>
-    </w:p>
-    <w:p>
-      <w:pPr>
-        <w:pStyle w:val="2"/>
-      </w:pPr>
-      <w:bookmarkStart w:id="4" w:name="_Toc243983717"/>
-      <w:r>
-        <w:t>Постановка задачи</w:t>
-      </w:r>
-      <w:bookmarkEnd w:id="4"/>
+        <w:t>о</w:t>
+      </w:r>
+      <w:r>
+        <w:t xml:space="preserve">перационная система: </w:t>
+      </w:r>
+      <w:proofErr w:type="spellStart"/>
+      <w:r>
+        <w:t>Windows</w:t>
+      </w:r>
+      <w:proofErr w:type="spellEnd"/>
+      <w:r>
+        <w:t xml:space="preserve"> 10/11, </w:t>
+      </w:r>
+      <w:proofErr w:type="spellStart"/>
+      <w:r>
+        <w:t>macOS</w:t>
+      </w:r>
+      <w:proofErr w:type="spellEnd"/>
+      <w:r>
+        <w:t xml:space="preserve">, </w:t>
+      </w:r>
+      <w:proofErr w:type="spellStart"/>
+      <w:r>
+        <w:t>Linux</w:t>
+      </w:r>
+      <w:proofErr w:type="spellEnd"/>
+      <w:r>
+        <w:t>;</w:t>
+      </w:r>
+    </w:p>
+    <w:p>
+      <w:pPr>
+        <w:pStyle w:val="a1"/>
+      </w:pPr>
+      <w:r>
+        <w:t>п</w:t>
+      </w:r>
+      <w:r>
+        <w:t xml:space="preserve">рограммное обеспечение: браузер </w:t>
+      </w:r>
+      <w:proofErr w:type="spellStart"/>
+      <w:r>
+        <w:t>Google</w:t>
+      </w:r>
+      <w:proofErr w:type="spellEnd"/>
+      <w:r>
+        <w:t xml:space="preserve"> </w:t>
+      </w:r>
+      <w:proofErr w:type="spellStart"/>
+      <w:r>
+        <w:t>Chrome</w:t>
+      </w:r>
+      <w:proofErr w:type="spellEnd"/>
+      <w:r>
+        <w:t>;</w:t>
+      </w:r>
+    </w:p>
+    <w:p>
+      <w:pPr>
+        <w:pStyle w:val="a1"/>
+      </w:pPr>
+      <w:r>
+        <w:t>о</w:t>
+      </w:r>
+      <w:r>
+        <w:t>перативная память: не менее 4 ГБ.</w:t>
+      </w:r>
     </w:p>
     <w:p>
       <w:pPr>
         <w:pStyle w:val="a3"/>
       </w:pPr>
       <w:r>
-        <w:t>Разрабатываемое ПО</w:t>
-      </w:r>
-      <w:r>
-        <w:t xml:space="preserve"> будет</w:t>
-      </w:r>
-      <w:r>
-        <w:t xml:space="preserve"> представля</w:t>
-      </w:r>
-      <w:r>
-        <w:t>ть</w:t>
-      </w:r>
-      <w:r>
-        <w:t xml:space="preserve"> собой клиент-серверное веб-приложение. Серверная часть </w:t>
-      </w:r>
-      <w:r>
-        <w:t xml:space="preserve">будет </w:t>
-      </w:r>
-      <w:r>
-        <w:t>реализована</w:t>
-      </w:r>
+        <w:t>К серверу предъявляются требования:</w:t>
+      </w:r>
+    </w:p>
+    <w:p>
+      <w:pPr>
+        <w:pStyle w:val="a1"/>
+      </w:pPr>
+      <w:r>
+        <w:t>о</w:t>
+      </w:r>
+      <w:r>
+        <w:t xml:space="preserve">перационная система: </w:t>
+      </w:r>
+      <w:proofErr w:type="spellStart"/>
+      <w:r>
+        <w:t>Windows</w:t>
+      </w:r>
+      <w:proofErr w:type="spellEnd"/>
       <w:r>
         <w:t xml:space="preserve"> </w:t>
       </w:r>
-      <w:r>
-        <w:t xml:space="preserve">на платформе ASP.NET Core и </w:t>
-      </w:r>
-      <w:r>
-        <w:t xml:space="preserve">будет обеспечивать </w:t>
-      </w:r>
-      <w:r>
-        <w:t xml:space="preserve">бизнес-логику, разграничение прав доступа и взаимодействие с базой данных PostgreSQL, которая отвечает за централизованное хранение информации и многопользовательский режим работы. Клиентская </w:t>
-      </w:r>
-      <w:r>
-        <w:t>часть</w:t>
-      </w:r>
-      <w:r>
-        <w:t xml:space="preserve"> будет</w:t>
-      </w:r>
-      <w:r>
-        <w:t xml:space="preserve"> обеспечива</w:t>
-      </w:r>
-      <w:r>
-        <w:t>ть</w:t>
-      </w:r>
-      <w:r>
-        <w:t xml:space="preserve"> интерактивный пользовательский интерфейс для работы с текстами и аннотациями в веб-браузере.</w:t>
-      </w:r>
-    </w:p>
-    <w:p>
-      <w:pPr>
-        <w:pStyle w:val="a3"/>
-      </w:pPr>
-      <w:r>
-        <w:lastRenderedPageBreak/>
-        <w:t>Пользователь должен иметь возможность просматривать каталог исполнителей, альбомов и музыкальных треков, осуществлять поиск и фильтрацию песен по жанрам, популярности и дате релиза, а также проходить регистрацию и авторизацию для доступа к личном</w:t>
-      </w:r>
-      <w:r>
-        <w:t>у</w:t>
-      </w:r>
-      <w:r>
-        <w:t xml:space="preserve"> кабинету.</w:t>
-      </w:r>
-    </w:p>
-    <w:p>
-      <w:pPr>
-        <w:pStyle w:val="a3"/>
-      </w:pPr>
-      <w:r>
-        <w:t>Авторизованный пользователь должен иметь возможность интерактивно выделять фрагменты текста песен, предлагать свои варианты интерпретации, участвовать в обсуждениях, комментировать разборы и голосовать за наиболее точные трактовки смыслов.</w:t>
-      </w:r>
-    </w:p>
-    <w:p>
-      <w:pPr>
-        <w:pStyle w:val="a3"/>
-      </w:pPr>
-      <w:r>
-        <w:t xml:space="preserve">Автор песен должен иметь доступ к управлению каталогом собственных треков, возможности добавления и редактирования официальных текстов песен, публикации подтвержденных аннотаций от своего имени, а также к функции выгрузки статистических данных по просмотрам </w:t>
-      </w:r>
-      <w:r>
-        <w:t>треков в формате *</w:t>
-      </w:r>
-      <w:r>
-        <w:t>.csv для последующего анализа.</w:t>
-      </w:r>
-    </w:p>
-    <w:p>
-      <w:pPr>
-        <w:pStyle w:val="a3"/>
-      </w:pPr>
-      <w:r>
-        <w:t>Музыкальный критик должен обладать инструментами для написания развернутых экспертных разборов на музыкальные произведения, а также механизмами верификации и подтверждения пользовательских аннотаций, устанавливая для них статус достоверных.</w:t>
-      </w:r>
-    </w:p>
-    <w:p>
-      <w:pPr>
-        <w:pStyle w:val="2"/>
-      </w:pPr>
-      <w:bookmarkStart w:id="5" w:name="_Toc243983718"/>
-      <w:r>
-        <w:t>Выбор состава программных и технических средств</w:t>
-      </w:r>
-      <w:bookmarkEnd w:id="5"/>
-    </w:p>
-    <w:p>
-      <w:pPr>
-        <w:pStyle w:val="a3"/>
-      </w:pPr>
-      <w:r>
-        <w:t>Архитектура решения является веб-ориентированной, трехзвенной (клиент-сервер-база данных): клиентская часть функционирует в веб-браузере пользователя и взаимодействует через протокол HTTP/HTTPS с серверной частью, которая, в свою очередь, обрабатывает бизнес-логику и осуществляет безопасный доступ к централизованной базе данных.</w:t>
-      </w:r>
-    </w:p>
-    <w:p>
-      <w:pPr>
-        <w:pStyle w:val="a3"/>
-      </w:pPr>
-      <w:r>
-        <w:t xml:space="preserve">Серверная часть реализуется на языке C# с использованием платформы ASP.NET Core. </w:t>
-      </w:r>
-      <w:r>
-        <w:t>Этот язык</w:t>
-      </w:r>
-      <w:r>
-        <w:t xml:space="preserve"> выбран из-за высокой производительности, кроссплатформенности и развитых средств разграничения прав доступа. Вся ключевая бизнес-логика изолирована на стороне сервера, что гарантирует безопасность данных и исключает прямой доступ клиентов к хранилищу.</w:t>
-      </w:r>
-    </w:p>
-    <w:p>
-      <w:pPr>
-        <w:pStyle w:val="a3"/>
-      </w:pPr>
-      <w:r>
-        <w:lastRenderedPageBreak/>
-        <w:t>Доступ к данным выполняется через ORM-систему Entity Framework Core, которая автоматизирует составление SQL-запросов. Данные хранятся в СУБД PostgreSQL, выбранной благодаря ее высокой надежности, бесплатной лицензии</w:t>
-      </w:r>
-      <w:r>
-        <w:t>.</w:t>
-      </w:r>
-    </w:p>
-    <w:p>
-      <w:pPr>
-        <w:pStyle w:val="a3"/>
-      </w:pPr>
-      <w:r>
-        <w:t>Разработка серверной и клиентской частей ПО осуществляется в IDE Microsoft Visual Studio 2026</w:t>
-      </w:r>
-      <w:r>
-        <w:t>, которая выбрана благодаря её полной нативной интеграции с платформой ASP.NET Core и языком C#, развитым визуальным инструментам для проектирования архитектуры, а также</w:t>
-      </w:r>
-      <w:r>
-        <w:t xml:space="preserve"> </w:t>
-      </w:r>
-      <w:r>
-        <w:t>встроенным средствам профилирования производительности, отладки веб-запросов и управления миграциями базы данных Entity Framework Core в едином рабочем пространстве.</w:t>
-      </w:r>
-    </w:p>
-    <w:p>
-      <w:pPr>
-        <w:pStyle w:val="a3"/>
-      </w:pPr>
-      <w:r>
-        <w:t>К клиентскому компьютеру предъявляются требования:</w:t>
+      <w:proofErr w:type="spellStart"/>
+      <w:r>
+        <w:t>Server</w:t>
+      </w:r>
+      <w:proofErr w:type="spellEnd"/>
+      <w:r>
+        <w:t>;</w:t>
       </w:r>
     </w:p>
     <w:p>
@@ -3443,10 +3906,48 @@
         <w:pStyle w:val="a1"/>
       </w:pPr>
       <w:r>
+        <w:t>п</w:t>
+      </w:r>
+      <w:r>
+        <w:t xml:space="preserve">рограммное обеспечение: установленная среда выполнения .NET </w:t>
+      </w:r>
+      <w:proofErr w:type="spellStart"/>
+      <w:r>
+        <w:t>Runtime</w:t>
+      </w:r>
+      <w:proofErr w:type="spellEnd"/>
+      <w:r>
+        <w:t xml:space="preserve">, СУБД </w:t>
+      </w:r>
+      <w:proofErr w:type="spellStart"/>
+      <w:r>
+        <w:t>PostgreSQL</w:t>
+      </w:r>
+      <w:proofErr w:type="spellEnd"/>
+      <w:r>
+        <w:t>;</w:t>
+      </w:r>
+    </w:p>
+    <w:p>
+      <w:pPr>
+        <w:pStyle w:val="a1"/>
+      </w:pPr>
+      <w:r>
+        <w:t>п</w:t>
+      </w:r>
+      <w:r>
+        <w:t>роцессор: не менее 2 ядер;</w:t>
+      </w:r>
+    </w:p>
+    <w:p>
+      <w:pPr>
+        <w:pStyle w:val="a1"/>
+      </w:pPr>
+      <w:r>
         <w:t>о</w:t>
       </w:r>
       <w:r>
-        <w:t>перационная система: Windows 10/11, macOS, Linux;</w:t>
+        <w:t>перативная память: не менее 8 ГБ;</w:t>
       </w:r>
     </w:p>
     <w:p>
@@ -3454,80 +3955,6 @@
         <w:pStyle w:val="a1"/>
       </w:pPr>
       <w:r>
-        <w:t>п</w:t>
-      </w:r>
-      <w:r>
-        <w:t>рограммное обеспечение: браузер Google Chrome;</w:t>
-      </w:r>
-    </w:p>
-    <w:p>
-      <w:pPr>
-        <w:pStyle w:val="a1"/>
-      </w:pPr>
-      <w:r>
-        <w:t>о</w:t>
-      </w:r>
-      <w:r>
-        <w:t>перативная память: не менее 4 ГБ.</w:t>
-      </w:r>
-    </w:p>
-    <w:p>
-      <w:pPr>
-        <w:pStyle w:val="a3"/>
-      </w:pPr>
-      <w:r>
-        <w:t>К серверу предъявляются требования:</w:t>
-      </w:r>
-    </w:p>
-    <w:p>
-      <w:pPr>
-        <w:pStyle w:val="a1"/>
-      </w:pPr>
-      <w:r>
-        <w:t>о</w:t>
-      </w:r>
-      <w:r>
-        <w:t>перационная система: Windows Server;</w:t>
-      </w:r>
-    </w:p>
-    <w:p>
-      <w:pPr>
-        <w:pStyle w:val="a1"/>
-      </w:pPr>
-      <w:r>
-        <w:t>п</w:t>
-      </w:r>
-      <w:r>
-        <w:t>рограммное обеспечение: установленная среда выполнения .NET Runtime, СУБД PostgreSQL;</w:t>
-      </w:r>
-    </w:p>
-    <w:p>
-      <w:pPr>
-        <w:pStyle w:val="a1"/>
-      </w:pPr>
-      <w:r>
-        <w:t>п</w:t>
-      </w:r>
-      <w:r>
-        <w:t>роцессор: не менее 2 ядер;</w:t>
-      </w:r>
-    </w:p>
-    <w:p>
-      <w:pPr>
-        <w:pStyle w:val="a1"/>
-      </w:pPr>
-      <w:r>
-        <w:t>о</w:t>
-      </w:r>
-      <w:r>
-        <w:t>перативная память: не менее 8 ГБ;</w:t>
-      </w:r>
-    </w:p>
-    <w:p>
-      <w:pPr>
-        <w:pStyle w:val="a1"/>
-      </w:pPr>
-      <w:r>
         <w:t>с</w:t>
       </w:r>
       <w:r>
@@ -3538,22 +3965,22 @@
       <w:pPr>
         <w:pStyle w:val="1"/>
       </w:pPr>
-      <w:bookmarkStart w:id="6" w:name="_Toc243983719"/>
+      <w:bookmarkStart w:id="7" w:name="_Toc243983719"/>
       <w:r>
         <w:lastRenderedPageBreak/>
         <w:t>Проектирование программного обеспечения</w:t>
       </w:r>
-      <w:bookmarkEnd w:id="6"/>
+      <w:bookmarkEnd w:id="7"/>
     </w:p>
     <w:p>
       <w:pPr>
         <w:pStyle w:val="2"/>
       </w:pPr>
-      <w:bookmarkStart w:id="7" w:name="_Toc243983720"/>
+      <w:bookmarkStart w:id="8" w:name="_Toc243983720"/>
       <w:r>
         <w:t>Проектирование интерфейса пользователя</w:t>
       </w:r>
-      <w:bookmarkEnd w:id="7"/>
+      <w:bookmarkEnd w:id="8"/>
     </w:p>
     <w:p>
       <w:pPr>
@@ -3564,11 +3991,11 @@
       <w:pPr>
         <w:pStyle w:val="2"/>
       </w:pPr>
-      <w:bookmarkStart w:id="8" w:name="_Toc243983721"/>
+      <w:bookmarkStart w:id="9" w:name="_Toc243983721"/>
       <w:r>
         <w:t>Разработка архитектуры программного обеспечения</w:t>
       </w:r>
-      <w:bookmarkEnd w:id="8"/>
+      <w:bookmarkEnd w:id="9"/>
     </w:p>
     <w:p>
       <w:pPr>
@@ -3579,11 +4006,11 @@
       <w:pPr>
         <w:pStyle w:val="2"/>
       </w:pPr>
-      <w:bookmarkStart w:id="9" w:name="_Toc243983722"/>
+      <w:bookmarkStart w:id="10" w:name="_Toc243983722"/>
       <w:r>
         <w:t>Проектирование базы данных</w:t>
       </w:r>
-      <w:bookmarkEnd w:id="9"/>
+      <w:bookmarkEnd w:id="10"/>
     </w:p>
     <w:p>
       <w:pPr>
@@ -3594,12 +4021,12 @@
       <w:pPr>
         <w:pStyle w:val="1"/>
       </w:pPr>
-      <w:bookmarkStart w:id="10" w:name="_Toc243983723"/>
+      <w:bookmarkStart w:id="11" w:name="_Toc243983723"/>
       <w:r>
         <w:lastRenderedPageBreak/>
         <w:t>Разработка модулей программного обеспечения</w:t>
       </w:r>
-      <w:bookmarkEnd w:id="10"/>
+      <w:bookmarkEnd w:id="11"/>
     </w:p>
     <w:p>
       <w:pPr>
@@ -3608,11 +4035,11 @@
           <w:lang w:val="en-US"/>
         </w:rPr>
       </w:pPr>
-      <w:bookmarkStart w:id="11" w:name="_Toc243983724"/>
+      <w:bookmarkStart w:id="12" w:name="_Toc243983724"/>
       <w:r>
         <w:t>Разработка программных модулей</w:t>
       </w:r>
-      <w:bookmarkEnd w:id="11"/>
+      <w:bookmarkEnd w:id="12"/>
     </w:p>
     <w:p>
       <w:pPr>
@@ -3629,11 +4056,11 @@
           <w:lang w:val="en-US"/>
         </w:rPr>
       </w:pPr>
-      <w:bookmarkStart w:id="12" w:name="_Toc243983725"/>
+      <w:bookmarkStart w:id="13" w:name="_Toc243983725"/>
       <w:r>
         <w:t>Реализация интерфейса пользователя</w:t>
       </w:r>
-      <w:bookmarkEnd w:id="12"/>
+      <w:bookmarkEnd w:id="13"/>
     </w:p>
     <w:p>
       <w:pPr>
@@ -3650,11 +4077,11 @@
           <w:lang w:val="en-US"/>
         </w:rPr>
       </w:pPr>
-      <w:bookmarkStart w:id="13" w:name="_Toc243983726"/>
+      <w:bookmarkStart w:id="14" w:name="_Toc243983726"/>
       <w:r>
         <w:t>Разграничение прав доступа пользователей</w:t>
       </w:r>
-      <w:bookmarkEnd w:id="13"/>
+      <w:bookmarkEnd w:id="14"/>
     </w:p>
     <w:p>
       <w:pPr>
@@ -3668,22 +4095,22 @@
       <w:pPr>
         <w:pStyle w:val="1"/>
       </w:pPr>
-      <w:bookmarkStart w:id="14" w:name="_Toc243983727"/>
+      <w:bookmarkStart w:id="15" w:name="_Toc243983727"/>
       <w:r>
         <w:lastRenderedPageBreak/>
         <w:t>Тестирование и отладка программного обеспечения</w:t>
       </w:r>
-      <w:bookmarkEnd w:id="14"/>
+      <w:bookmarkEnd w:id="15"/>
     </w:p>
     <w:p>
       <w:pPr>
         <w:pStyle w:val="2"/>
       </w:pPr>
-      <w:bookmarkStart w:id="15" w:name="_Toc243983728"/>
+      <w:bookmarkStart w:id="16" w:name="_Toc243983728"/>
       <w:r>
         <w:t>Структурное тестирование</w:t>
       </w:r>
-      <w:bookmarkEnd w:id="15"/>
+      <w:bookmarkEnd w:id="16"/>
     </w:p>
     <w:p>
       <w:pPr>
@@ -3694,11 +4121,11 @@
       <w:pPr>
         <w:pStyle w:val="2"/>
       </w:pPr>
-      <w:bookmarkStart w:id="16" w:name="_Toc243983729"/>
+      <w:bookmarkStart w:id="17" w:name="_Toc243983729"/>
       <w:r>
         <w:t>Функциональное тестирование</w:t>
       </w:r>
-      <w:bookmarkEnd w:id="16"/>
+      <w:bookmarkEnd w:id="17"/>
     </w:p>
     <w:p>
       <w:pPr>
@@ -3709,22 +4136,22 @@
       <w:pPr>
         <w:pStyle w:val="1"/>
       </w:pPr>
-      <w:bookmarkStart w:id="17" w:name="_Toc243983730"/>
+      <w:bookmarkStart w:id="18" w:name="_Toc243983730"/>
       <w:r>
         <w:lastRenderedPageBreak/>
         <w:t>Инструкция по эксплуатации программного обеспечения</w:t>
       </w:r>
-      <w:bookmarkEnd w:id="17"/>
+      <w:bookmarkEnd w:id="18"/>
     </w:p>
     <w:p>
       <w:pPr>
         <w:pStyle w:val="2"/>
       </w:pPr>
-      <w:bookmarkStart w:id="18" w:name="_Toc243983731"/>
+      <w:bookmarkStart w:id="19" w:name="_Toc243983731"/>
       <w:r>
         <w:t>Установка программного обеспечения</w:t>
       </w:r>
-      <w:bookmarkEnd w:id="18"/>
+      <w:bookmarkEnd w:id="19"/>
     </w:p>
     <w:p>
       <w:pPr>
@@ -3735,11 +4162,11 @@
       <w:pPr>
         <w:pStyle w:val="2"/>
       </w:pPr>
-      <w:bookmarkStart w:id="19" w:name="_Toc243983732"/>
+      <w:bookmarkStart w:id="20" w:name="_Toc243983732"/>
       <w:r>
         <w:t>Инструкция по работе</w:t>
       </w:r>
-      <w:bookmarkEnd w:id="19"/>
+      <w:bookmarkEnd w:id="20"/>
     </w:p>
     <w:p>
       <w:pPr>
@@ -3750,12 +4177,12 @@
       <w:pPr>
         <w:pStyle w:val="a7"/>
       </w:pPr>
-      <w:bookmarkStart w:id="20" w:name="_Toc243983733"/>
+      <w:bookmarkStart w:id="21" w:name="_Toc243983733"/>
       <w:r>
         <w:lastRenderedPageBreak/>
         <w:t>Заключение</w:t>
       </w:r>
-      <w:bookmarkEnd w:id="20"/>
+      <w:bookmarkEnd w:id="21"/>
     </w:p>
     <w:p>
       <w:pPr>
@@ -3769,12 +4196,12 @@
       <w:pPr>
         <w:pStyle w:val="a7"/>
       </w:pPr>
-      <w:bookmarkStart w:id="21" w:name="_Toc243983734"/>
+      <w:bookmarkStart w:id="22" w:name="_Toc243983734"/>
       <w:r>
         <w:lastRenderedPageBreak/>
         <w:t>Список использованных источников</w:t>
       </w:r>
-      <w:bookmarkEnd w:id="21"/>
+      <w:bookmarkEnd w:id="22"/>
     </w:p>
     <w:p>
       <w:pPr>
@@ -3799,7 +4226,7 @@
 </file>
 
 <file path=word/endnotes.xml><?xml version="1.0" encoding="utf-8"?>
-<w:endnotes xmlns:wpc="http://schemas.microsoft.com/office/word/2010/wordprocessingCanvas" xmlns:cx="http://schemas.microsoft.com/office/drawing/2014/chartex" xmlns:cx1="http://schemas.microsoft.com/office/drawing/2015/9/8/chartex" xmlns:cx2="http://schemas.microsoft.com/office/drawing/2015/10/21/chartex" xmlns:cx3="http://schemas.microsoft.com/office/drawing/2016/5/9/chartex" xmlns:cx4="http://schemas.microsoft.com/office/drawing/2016/5/10/chartex" xmlns:cx5="http://schemas.microsoft.com/office/drawing/2016/5/11/chartex" xmlns:cx6="http://schemas.microsoft.com/office/drawing/2016/5/12/chartex" xmlns:cx7="http://schemas.microsoft.com/office/drawing/2016/5/13/chartex" xmlns:cx8="http://schemas.microsoft.com/office/drawing/2016/5/14/chartex" xmlns:mc="http://schemas.openxmlformats.org/markup-compatibility/2006" xmlns:aink="http://schemas.microsoft.com/office/drawing/2016/ink" xmlns:am3d="http://schemas.microsoft.com/office/drawing/2017/model3d" xmlns:o="urn:schemas-microsoft-com:office:office" xmlns:oel="http://schemas.microsoft.com/office/2019/extlst" xmlns:r="http://schemas.openxmlformats.org/officeDocument/2006/relationships" xmlns:m="http://schemas.openxmlformats.org/officeDocument/2006/math" xmlns:v="urn:schemas-microsoft-com:vml" xmlns:wp14="http://schemas.microsoft.com/office/word/2010/wordprocessingDrawing" xmlns:wp="http://schemas.openxmlformats.org/drawingml/2006/wordprocessingDrawing" xmlns:w10="urn:schemas-microsoft-com:office:word" xmlns:w="http://schemas.openxmlformats.org/wordprocessingml/2006/main" xmlns:w14="http://schemas.microsoft.com/office/word/2010/wordml" xmlns:w15="http://schemas.microsoft.com/office/word/2012/wordml" xmlns:w16cex="http://schemas.microsoft.com/office/word/2018/wordml/cex" xmlns:w16cid="http://schemas.microsoft.com/office/word/2016/wordml/cid" xmlns:w16="http://schemas.microsoft.com/office/word/2018/wordml" xmlns:w16sdtdh="http://schemas.microsoft.com/office/word/2020/wordml/sdtdatahash" xmlns:w16se="http://schemas.microsoft.com/office/word/2015/wordml/symex" xmlns:wpg="http://schemas.microsoft.com/office/word/2010/wordprocessingGroup" xmlns:wpi="http://schemas.microsoft.com/office/word/2010/wordprocessingInk" xmlns:wne="http://schemas.microsoft.com/office/word/2006/wordml" xmlns:wps="http://schemas.microsoft.com/office/word/2010/wordprocessingShape" mc:Ignorable="w14 w15 w16se w16cid w16 w16cex w16sdtdh wp14">
+<w:endnotes xmlns:wpc="http://schemas.microsoft.com/office/word/2010/wordprocessingCanvas" xmlns:cx="http://schemas.microsoft.com/office/drawing/2014/chartex" xmlns:mc="http://schemas.openxmlformats.org/markup-compatibility/2006" xmlns:o="urn:schemas-microsoft-com:office:office" xmlns:r="http://schemas.openxmlformats.org/officeDocument/2006/relationships" xmlns:m="http://schemas.openxmlformats.org/officeDocument/2006/math" xmlns:v="urn:schemas-microsoft-com:vml" xmlns:wp14="http://schemas.microsoft.com/office/word/2010/wordprocessingDrawing" xmlns:wp="http://schemas.openxmlformats.org/drawingml/2006/wordprocessingDrawing" xmlns:w10="urn:schemas-microsoft-com:office:word" xmlns:w="http://schemas.openxmlformats.org/wordprocessingml/2006/main" xmlns:w14="http://schemas.microsoft.com/office/word/2010/wordml" xmlns:w15="http://schemas.microsoft.com/office/word/2012/wordml" xmlns:w16se="http://schemas.microsoft.com/office/word/2015/wordml/symex" xmlns:wpg="http://schemas.microsoft.com/office/word/2010/wordprocessingGroup" xmlns:wpi="http://schemas.microsoft.com/office/word/2010/wordprocessingInk" xmlns:wne="http://schemas.microsoft.com/office/word/2006/wordml" xmlns:wps="http://schemas.microsoft.com/office/word/2010/wordprocessingShape" mc:Ignorable="w14 w15 w16se wp14">
   <w:endnote w:type="separator" w:id="-1">
     <w:p>
       <w:r>
@@ -3818,7 +4245,7 @@
 </file>
 
 <file path=word/footer1.xml><?xml version="1.0" encoding="utf-8"?>
-<w:ftr xmlns:wpc="http://schemas.microsoft.com/office/word/2010/wordprocessingCanvas" xmlns:cx="http://schemas.microsoft.com/office/drawing/2014/chartex" xmlns:cx1="http://schemas.microsoft.com/office/drawing/2015/9/8/chartex" xmlns:cx2="http://schemas.microsoft.com/office/drawing/2015/10/21/chartex" xmlns:cx3="http://schemas.microsoft.com/office/drawing/2016/5/9/chartex" xmlns:cx4="http://schemas.microsoft.com/office/drawing/2016/5/10/chartex" xmlns:cx5="http://schemas.microsoft.com/office/drawing/2016/5/11/chartex" xmlns:cx6="http://schemas.microsoft.com/office/drawing/2016/5/12/chartex" xmlns:cx7="http://schemas.microsoft.com/office/drawing/2016/5/13/chartex" xmlns:cx8="http://schemas.microsoft.com/office/drawing/2016/5/14/chartex" xmlns:mc="http://schemas.openxmlformats.org/markup-compatibility/2006" xmlns:aink="http://schemas.microsoft.com/office/drawing/2016/ink" xmlns:am3d="http://schemas.microsoft.com/office/drawing/2017/model3d" xmlns:o="urn:schemas-microsoft-com:office:office" xmlns:oel="http://schemas.microsoft.com/office/2019/extlst" xmlns:r="http://schemas.openxmlformats.org/officeDocument/2006/relationships" xmlns:m="http://schemas.openxmlformats.org/officeDocument/2006/math" xmlns:v="urn:schemas-microsoft-com:vml" xmlns:wp14="http://schemas.microsoft.com/office/word/2010/wordprocessingDrawing" xmlns:wp="http://schemas.openxmlformats.org/drawingml/2006/wordprocessingDrawing" xmlns:w10="urn:schemas-microsoft-com:office:word" xmlns:w="http://schemas.openxmlformats.org/wordprocessingml/2006/main" xmlns:w14="http://schemas.microsoft.com/office/word/2010/wordml" xmlns:w15="http://schemas.microsoft.com/office/word/2012/wordml" xmlns:w16cex="http://schemas.microsoft.com/office/word/2018/wordml/cex" xmlns:w16cid="http://schemas.microsoft.com/office/word/2016/wordml/cid" xmlns:w16="http://schemas.microsoft.com/office/word/2018/wordml" xmlns:w16sdtdh="http://schemas.microsoft.com/office/word/2020/wordml/sdtdatahash" xmlns:w16se="http://schemas.microsoft.com/office/word/2015/wordml/symex" xmlns:wpg="http://schemas.microsoft.com/office/word/2010/wordprocessingGroup" xmlns:wpi="http://schemas.microsoft.com/office/word/2010/wordprocessingInk" xmlns:wne="http://schemas.microsoft.com/office/word/2006/wordml" xmlns:wps="http://schemas.microsoft.com/office/word/2010/wordprocessingShape" mc:Ignorable="w14 w15 w16se w16cid w16 w16cex w16sdtdh wp14">
+<w:ftr xmlns:wpc="http://schemas.microsoft.com/office/word/2010/wordprocessingCanvas" xmlns:cx="http://schemas.microsoft.com/office/drawing/2014/chartex" xmlns:mc="http://schemas.openxmlformats.org/markup-compatibility/2006" xmlns:o="urn:schemas-microsoft-com:office:office" xmlns:r="http://schemas.openxmlformats.org/officeDocument/2006/relationships" xmlns:m="http://schemas.openxmlformats.org/officeDocument/2006/math" xmlns:v="urn:schemas-microsoft-com:vml" xmlns:wp14="http://schemas.microsoft.com/office/word/2010/wordprocessingDrawing" xmlns:wp="http://schemas.openxmlformats.org/drawingml/2006/wordprocessingDrawing" xmlns:w10="urn:schemas-microsoft-com:office:word" xmlns:w="http://schemas.openxmlformats.org/wordprocessingml/2006/main" xmlns:w14="http://schemas.microsoft.com/office/word/2010/wordml" xmlns:w15="http://schemas.microsoft.com/office/word/2012/wordml" xmlns:w16se="http://schemas.microsoft.com/office/word/2015/wordml/symex" xmlns:wpg="http://schemas.microsoft.com/office/word/2010/wordprocessingGroup" xmlns:wpi="http://schemas.microsoft.com/office/word/2010/wordprocessingInk" xmlns:wne="http://schemas.microsoft.com/office/word/2006/wordml" xmlns:wps="http://schemas.microsoft.com/office/word/2010/wordprocessingShape" mc:Ignorable="w14 w15 w16se wp14">
   <w:sdt>
     <w:sdtPr>
       <w:id w:val="1643229897"/>
@@ -3827,6 +4254,7 @@
         <w:docPartUnique/>
       </w:docPartObj>
     </w:sdtPr>
+    <w:sdtEndPr/>
     <w:sdtContent>
       <w:p>
         <w:pPr>
@@ -3846,7 +4274,7 @@
           <w:rPr>
             <w:noProof/>
           </w:rPr>
-          <w:t>2</w:t>
+          <w:t>8</w:t>
         </w:r>
         <w:r>
           <w:fldChar w:fldCharType="end"/>
@@ -3858,7 +4286,7 @@
 </file>
 
 <file path=word/footnotes.xml><?xml version="1.0" encoding="utf-8"?>
-<w:footnotes xmlns:wpc="http://schemas.microsoft.com/office/word/2010/wordprocessingCanvas" xmlns:cx="http://schemas.microsoft.com/office/drawing/2014/chartex" xmlns:cx1="http://schemas.microsoft.com/office/drawing/2015/9/8/chartex" xmlns:cx2="http://schemas.microsoft.com/office/drawing/2015/10/21/chartex" xmlns:cx3="http://schemas.microsoft.com/office/drawing/2016/5/9/chartex" xmlns:cx4="http://schemas.microsoft.com/office/drawing/2016/5/10/chartex" xmlns:cx5="http://schemas.microsoft.com/office/drawing/2016/5/11/chartex" xmlns:cx6="http://schemas.microsoft.com/office/drawing/2016/5/12/chartex" xmlns:cx7="http://schemas.microsoft.com/office/drawing/2016/5/13/chartex" xmlns:cx8="http://schemas.microsoft.com/office/drawing/2016/5/14/chartex" xmlns:mc="http://schemas.openxmlformats.org/markup-compatibility/2006" xmlns:aink="http://schemas.microsoft.com/office/drawing/2016/ink" xmlns:am3d="http://schemas.microsoft.com/office/drawing/2017/model3d" xmlns:o="urn:schemas-microsoft-com:office:office" xmlns:oel="http://schemas.microsoft.com/office/2019/extlst" xmlns:r="http://schemas.openxmlformats.org/officeDocument/2006/relationships" xmlns:m="http://schemas.openxmlformats.org/officeDocument/2006/math" xmlns:v="urn:schemas-microsoft-com:vml" xmlns:wp14="http://schemas.microsoft.com/office/word/2010/wordprocessingDrawing" xmlns:wp="http://schemas.openxmlformats.org/drawingml/2006/wordprocessingDrawing" xmlns:w10="urn:schemas-microsoft-com:office:word" xmlns:w="http://schemas.openxmlformats.org/wordprocessingml/2006/main" xmlns:w14="http://schemas.microsoft.com/office/word/2010/wordml" xmlns:w15="http://schemas.microsoft.com/office/word/2012/wordml" xmlns:w16cex="http://schemas.microsoft.com/office/word/2018/wordml/cex" xmlns:w16cid="http://schemas.microsoft.com/office/word/2016/wordml/cid" xmlns:w16="http://schemas.microsoft.com/office/word/2018/wordml" xmlns:w16sdtdh="http://schemas.microsoft.com/office/word/2020/wordml/sdtdatahash" xmlns:w16se="http://schemas.microsoft.com/office/word/2015/wordml/symex" xmlns:wpg="http://schemas.microsoft.com/office/word/2010/wordprocessingGroup" xmlns:wpi="http://schemas.microsoft.com/office/word/2010/wordprocessingInk" xmlns:wne="http://schemas.microsoft.com/office/word/2006/wordml" xmlns:wps="http://schemas.microsoft.com/office/word/2010/wordprocessingShape" mc:Ignorable="w14 w15 w16se w16cid w16 w16cex w16sdtdh wp14">
+<w:footnotes xmlns:wpc="http://schemas.microsoft.com/office/word/2010/wordprocessingCanvas" xmlns:cx="http://schemas.microsoft.com/office/drawing/2014/chartex" xmlns:mc="http://schemas.openxmlformats.org/markup-compatibility/2006" xmlns:o="urn:schemas-microsoft-com:office:office" xmlns:r="http://schemas.openxmlformats.org/officeDocument/2006/relationships" xmlns:m="http://schemas.openxmlformats.org/officeDocument/2006/math" xmlns:v="urn:schemas-microsoft-com:vml" xmlns:wp14="http://schemas.microsoft.com/office/word/2010/wordprocessingDrawing" xmlns:wp="http://schemas.openxmlformats.org/drawingml/2006/wordprocessingDrawing" xmlns:w10="urn:schemas-microsoft-com:office:word" xmlns:w="http://schemas.openxmlformats.org/wordprocessingml/2006/main" xmlns:w14="http://schemas.microsoft.com/office/word/2010/wordml" xmlns:w15="http://schemas.microsoft.com/office/word/2012/wordml" xmlns:w16se="http://schemas.microsoft.com/office/word/2015/wordml/symex" xmlns:wpg="http://schemas.microsoft.com/office/word/2010/wordprocessingGroup" xmlns:wpi="http://schemas.microsoft.com/office/word/2010/wordprocessingInk" xmlns:wne="http://schemas.microsoft.com/office/word/2006/wordml" xmlns:wps="http://schemas.microsoft.com/office/word/2010/wordprocessingShape" mc:Ignorable="w14 w15 w16se wp14">
   <w:footnote w:type="separator" w:id="-1">
     <w:p>
       <w:r>
@@ -3877,7 +4305,7 @@
 </file>
 
 <file path=word/numbering.xml><?xml version="1.0" encoding="utf-8"?>
-<w:numbering xmlns:wpc="http://schemas.microsoft.com/office/word/2010/wordprocessingCanvas" xmlns:cx="http://schemas.microsoft.com/office/drawing/2014/chartex" xmlns:cx1="http://schemas.microsoft.com/office/drawing/2015/9/8/chartex" xmlns:cx2="http://schemas.microsoft.com/office/drawing/2015/10/21/chartex" xmlns:cx3="http://schemas.microsoft.com/office/drawing/2016/5/9/chartex" xmlns:cx4="http://schemas.microsoft.com/office/drawing/2016/5/10/chartex" xmlns:cx5="http://schemas.microsoft.com/office/drawing/2016/5/11/chartex" xmlns:cx6="http://schemas.microsoft.com/office/drawing/2016/5/12/chartex" xmlns:cx7="http://schemas.microsoft.com/office/drawing/2016/5/13/chartex" xmlns:cx8="http://schemas.microsoft.com/office/drawing/2016/5/14/chartex" xmlns:mc="http://schemas.openxmlformats.org/markup-compatibility/2006" xmlns:aink="http://schemas.microsoft.com/office/drawing/2016/ink" xmlns:am3d="http://schemas.microsoft.com/office/drawing/2017/model3d" xmlns:o="urn:schemas-microsoft-com:office:office" xmlns:oel="http://schemas.microsoft.com/office/2019/extlst" xmlns:r="http://schemas.openxmlformats.org/officeDocument/2006/relationships" xmlns:m="http://schemas.openxmlformats.org/officeDocument/2006/math" xmlns:v="urn:schemas-microsoft-com:vml" xmlns:wp14="http://schemas.microsoft.com/office/word/2010/wordprocessingDrawing" xmlns:wp="http://schemas.openxmlformats.org/drawingml/2006/wordprocessingDrawing" xmlns:w10="urn:schemas-microsoft-com:office:word" xmlns:w="http://schemas.openxmlformats.org/wordprocessingml/2006/main" xmlns:w14="http://schemas.microsoft.com/office/word/2010/wordml" xmlns:w15="http://schemas.microsoft.com/office/word/2012/wordml" xmlns:w16cex="http://schemas.microsoft.com/office/word/2018/wordml/cex" xmlns:w16cid="http://schemas.microsoft.com/office/word/2016/wordml/cid" xmlns:w16="http://schemas.microsoft.com/office/word/2018/wordml" xmlns:w16sdtdh="http://schemas.microsoft.com/office/word/2020/wordml/sdtdatahash" xmlns:w16se="http://schemas.microsoft.com/office/word/2015/wordml/symex" xmlns:wpg="http://schemas.microsoft.com/office/word/2010/wordprocessingGroup" xmlns:wpi="http://schemas.microsoft.com/office/word/2010/wordprocessingInk" xmlns:wne="http://schemas.microsoft.com/office/word/2006/wordml" xmlns:wps="http://schemas.microsoft.com/office/word/2010/wordprocessingShape" mc:Ignorable="w14 w15 w16se w16cid w16 w16cex w16sdtdh wp14">
+<w:numbering xmlns:wpc="http://schemas.microsoft.com/office/word/2010/wordprocessingCanvas" xmlns:cx="http://schemas.microsoft.com/office/drawing/2014/chartex" xmlns:mc="http://schemas.openxmlformats.org/markup-compatibility/2006" xmlns:o="urn:schemas-microsoft-com:office:office" xmlns:r="http://schemas.openxmlformats.org/officeDocument/2006/relationships" xmlns:m="http://schemas.openxmlformats.org/officeDocument/2006/math" xmlns:v="urn:schemas-microsoft-com:vml" xmlns:wp14="http://schemas.microsoft.com/office/word/2010/wordprocessingDrawing" xmlns:wp="http://schemas.openxmlformats.org/drawingml/2006/wordprocessingDrawing" xmlns:w10="urn:schemas-microsoft-com:office:word" xmlns:w="http://schemas.openxmlformats.org/wordprocessingml/2006/main" xmlns:w14="http://schemas.microsoft.com/office/word/2010/wordml" xmlns:w15="http://schemas.microsoft.com/office/word/2012/wordml" xmlns:w16se="http://schemas.microsoft.com/office/word/2015/wordml/symex" xmlns:wpg="http://schemas.microsoft.com/office/word/2010/wordprocessingGroup" xmlns:wpi="http://schemas.microsoft.com/office/word/2010/wordprocessingInk" xmlns:wne="http://schemas.microsoft.com/office/word/2006/wordml" xmlns:wps="http://schemas.microsoft.com/office/word/2010/wordprocessingShape" mc:Ignorable="w14 w15 w16se wp14">
   <w:abstractNum w:abstractNumId="0" w15:restartNumberingAfterBreak="0">
     <w:nsid w:val="0428275C"/>
     <w:multiLevelType w:val="hybridMultilevel"/>
@@ -4915,50 +5343,50 @@
       </w:pPr>
     </w:lvl>
   </w:abstractNum>
-  <w:num w:numId="1" w16cid:durableId="1399401621">
+  <w:num w:numId="1">
     <w:abstractNumId w:val="7"/>
   </w:num>
-  <w:num w:numId="2" w16cid:durableId="27148881">
+  <w:num w:numId="2">
     <w:abstractNumId w:val="3"/>
   </w:num>
-  <w:num w:numId="3" w16cid:durableId="453669665">
+  <w:num w:numId="3">
     <w:abstractNumId w:val="2"/>
   </w:num>
-  <w:num w:numId="4" w16cid:durableId="1209682954">
+  <w:num w:numId="4">
     <w:abstractNumId w:val="2"/>
     <w:lvlOverride w:ilvl="0">
       <w:startOverride w:val="1"/>
     </w:lvlOverride>
   </w:num>
-  <w:num w:numId="5" w16cid:durableId="1854107494">
+  <w:num w:numId="5">
     <w:abstractNumId w:val="2"/>
     <w:lvlOverride w:ilvl="0">
       <w:startOverride w:val="1"/>
     </w:lvlOverride>
   </w:num>
-  <w:num w:numId="6" w16cid:durableId="868955660">
+  <w:num w:numId="6">
     <w:abstractNumId w:val="4"/>
   </w:num>
-  <w:num w:numId="7" w16cid:durableId="1162964038">
+  <w:num w:numId="7">
     <w:abstractNumId w:val="5"/>
   </w:num>
-  <w:num w:numId="8" w16cid:durableId="95907901">
+  <w:num w:numId="8">
     <w:abstractNumId w:val="1"/>
   </w:num>
-  <w:num w:numId="9" w16cid:durableId="2132018008">
+  <w:num w:numId="9">
     <w:abstractNumId w:val="0"/>
   </w:num>
-  <w:num w:numId="10" w16cid:durableId="2093886303">
+  <w:num w:numId="10">
     <w:abstractNumId w:val="8"/>
   </w:num>
-  <w:num w:numId="11" w16cid:durableId="1050692949">
+  <w:num w:numId="11">
     <w:abstractNumId w:val="6"/>
   </w:num>
 </w:numbering>
 </file>
 
 <file path=word/styles.xml><?xml version="1.0" encoding="utf-8"?>
-<w:styles xmlns:mc="http://schemas.openxmlformats.org/markup-compatibility/2006" xmlns:r="http://schemas.openxmlformats.org/officeDocument/2006/relationships" xmlns:w="http://schemas.openxmlformats.org/wordprocessingml/2006/main" xmlns:w14="http://schemas.microsoft.com/office/word/2010/wordml" xmlns:w15="http://schemas.microsoft.com/office/word/2012/wordml" xmlns:w16cex="http://schemas.microsoft.com/office/word/2018/wordml/cex" xmlns:w16cid="http://schemas.microsoft.com/office/word/2016/wordml/cid" xmlns:w16="http://schemas.microsoft.com/office/word/2018/wordml" xmlns:w16sdtdh="http://schemas.microsoft.com/office/word/2020/wordml/sdtdatahash" xmlns:w16se="http://schemas.microsoft.com/office/word/2015/wordml/symex" mc:Ignorable="w14 w15 w16se w16cid w16 w16cex w16sdtdh">
+<w:styles xmlns:mc="http://schemas.openxmlformats.org/markup-compatibility/2006" xmlns:r="http://schemas.openxmlformats.org/officeDocument/2006/relationships" xmlns:w="http://schemas.openxmlformats.org/wordprocessingml/2006/main" xmlns:w14="http://schemas.microsoft.com/office/word/2010/wordml" xmlns:w15="http://schemas.microsoft.com/office/word/2012/wordml" xmlns:w16se="http://schemas.microsoft.com/office/word/2015/wordml/symex" mc:Ignorable="w14 w15 w16se">
   <w:docDefaults>
     <w:rPrDefault>
       <w:rPr>
@@ -4976,7 +5404,7 @@
       </w:pPr>
     </w:pPrDefault>
   </w:docDefaults>
-  <w:latentStyles w:defLockedState="0" w:defUIPriority="99" w:defSemiHidden="0" w:defUnhideWhenUsed="0" w:defQFormat="0" w:count="376">
+  <w:latentStyles w:defLockedState="0" w:defUIPriority="99" w:defSemiHidden="0" w:defUnhideWhenUsed="0" w:defQFormat="0" w:count="371">
     <w:lsdException w:name="Normal" w:uiPriority="0" w:qFormat="1"/>
     <w:lsdException w:name="heading 1" w:uiPriority="9" w:qFormat="1"/>
     <w:lsdException w:name="heading 2" w:semiHidden="1" w:uiPriority="9" w:unhideWhenUsed="1" w:qFormat="1"/>
@@ -5348,11 +5776,6 @@
     <w:lsdException w:name="List Table 5 Dark Accent 6" w:uiPriority="50"/>
     <w:lsdException w:name="List Table 6 Colorful Accent 6" w:uiPriority="51"/>
     <w:lsdException w:name="List Table 7 Colorful Accent 6" w:uiPriority="52"/>
-    <w:lsdException w:name="Mention" w:semiHidden="1" w:unhideWhenUsed="1"/>
-    <w:lsdException w:name="Smart Hyperlink" w:semiHidden="1" w:unhideWhenUsed="1"/>
-    <w:lsdException w:name="Hashtag" w:semiHidden="1" w:unhideWhenUsed="1"/>
-    <w:lsdException w:name="Unresolved Mention" w:semiHidden="1" w:unhideWhenUsed="1"/>
-    <w:lsdException w:name="Smart Link" w:semiHidden="1" w:unhideWhenUsed="1"/>
   </w:latentStyles>
   <w:style w:type="paragraph" w:default="1" w:styleId="a2">
     <w:name w:val="Normal"/>
@@ -6640,7 +7063,7 @@
 </file>
 
 <file path=customXml/itemProps1.xml><?xml version="1.0" encoding="utf-8"?>
-<ds:datastoreItem xmlns:ds="http://schemas.openxmlformats.org/officeDocument/2006/customXml" ds:itemID="{FE4880A1-4C62-489D-8BC2-D25FBC16E01B}">
+<ds:datastoreItem xmlns:ds="http://schemas.openxmlformats.org/officeDocument/2006/customXml" ds:itemID="{493A3154-93B4-46AF-B840-7DD93775F6F3}">
   <ds:schemaRefs>
     <ds:schemaRef ds:uri="http://schemas.openxmlformats.org/officeDocument/2006/bibliography"/>
   </ds:schemaRefs>

</xml_diff>